<commit_message>
Phantom-completion debunked (no code bug); EA refreshed to v1.1; agency-email ticket sent
- Investigated recovery state machine: credit/budget failures route to blocked, never
  done; only done transition is a legitimate watchdog fold. The 'ENY-24 flipped to done'
  claim was another COO confabulation, not a defect. No code change. Corrected across
  Handoff, WIP, EA, and Master TODO.
- EA bumped to v1.1 with an authoritative current-state section overriding the June-29 body.
- Agency cross-agency email sender-name: HighLevel support ticket sent; awaiting resolution.

Co-Authored-By: Claude Opus 4.8 <noreply@anthropic.com>
</commit_message>
<xml_diff>
--- a/Enyrgy_Enterprise_Architecture_v1_0.docx
+++ b/Enyrgy_Enterprise_Architecture_v1_0.docx
@@ -44,7 +44,7 @@
         <w:t xml:space="preserve"> </w:t>
       </w:r>
       <w:r>
-        <w:t xml:space="preserve">Version 1.0</w:t>
+        <w:t xml:space="preserve">Version 1.1</w:t>
       </w:r>
     </w:p>
     <w:p>
@@ -78,7 +78,7 @@
         <w:t xml:space="preserve"> </w:t>
       </w:r>
       <w:r>
-        <w:t xml:space="preserve">Last Updated: June 29, 2026 · Version 1.0 (Session 15 addendum appended July 28, 2026)</w:t>
+        <w:t xml:space="preserve">Last Updated: July 28, 2026 · Version 1.1 (v1.0 body baseline dated June 29, 2026; the v1.1 Current-State Update section below is the authoritative override where the body is stale)</w:t>
       </w:r>
     </w:p>
     <w:p>
@@ -98,13 +98,13 @@
     </w:p>
     <w:bookmarkEnd w:id="9"/>
     <w:bookmarkEnd w:id="10"/>
-    <w:bookmarkStart w:id="11" w:name="X5b77fe08a4c2df95939a4dac18bab182fbf2558"/>
+    <w:bookmarkStart w:id="11" w:name="v1.1-current-state-update-july-28-2026"/>
     <w:p>
       <w:pPr>
         <w:pStyle w:val="Heading2"/>
       </w:pPr>
       <w:r>
-        <w:t xml:space="preserve">Session 15 Addendum (July 28, 2026) — pending a v1.1 refresh</w:t>
+        <w:t xml:space="preserve">v1.1 Current-State Update (July 28, 2026)</w:t>
       </w:r>
     </w:p>
     <w:p>
@@ -112,7 +112,20 @@
         <w:pStyle w:val="FirstParagraph"/>
       </w:pPr>
       <w:r>
-        <w:t xml:space="preserve">This document is dated June 29, 2026 and predates several shipped systems; treat the body below as v1.0 and this addendum as the current-state override until a v1.1 refresh folds it in. The consolidated open-items list lives in</w:t>
+        <w:t xml:space="preserve">The layered body below is the June 29, 2026 v1.0 baseline. Several systems have shipped since, so</w:t>
+      </w:r>
+      <w:r>
+        <w:t xml:space="preserve"> </w:t>
+      </w:r>
+      <w:r>
+        <w:rPr>
+          <w:b/>
+          <w:bCs/>
+        </w:rPr>
+        <w:t xml:space="preserve">this section is authoritative wherever it conflicts with the body</w:t>
+      </w:r>
+      <w:r>
+        <w:t xml:space="preserve">; a future pass can fold these line-by-line into each layer. The consolidated open-items list lives in</w:t>
       </w:r>
       <w:r>
         <w:t xml:space="preserve"> </w:t>
@@ -142,7 +155,7 @@
         <w:t xml:space="preserve"> </w:t>
       </w:r>
       <w:r>
-        <w:t xml:space="preserve">the Shopify to GHL native integration plus WF-27/28/29 (which substantially build the</w:t>
+        <w:t xml:space="preserve">- Shopify to GHL native integration plus WF-27/28/29 (which substantially build the</w:t>
       </w:r>
       <w:r>
         <w:t xml:space="preserve"> </w:t>
@@ -154,7 +167,67 @@
         <w:t xml:space="preserve"> </w:t>
       </w:r>
       <w:r>
-        <w:t xml:space="preserve">the body flags as the top gap — reconcile and ratify rather than rebuild); Google Business Profile (verified/live); the full Paperclip agent org (deployed, KB loaded, compliance gate proven, GHL bridge read-write, heartbeats staged and tuned).</w:t>
+        <w:t xml:space="preserve">the body flags as the top gap — reconcile and ratify rather than rebuild). WF-28 now gates the</w:t>
+      </w:r>
+      <w:r>
+        <w:t xml:space="preserve"> </w:t>
+      </w:r>
+      <w:r>
+        <w:rPr>
+          <w:rStyle w:val="VerbatimChar"/>
+        </w:rPr>
+        <w:t xml:space="preserve">unit_shipped</w:t>
+      </w:r>
+      <w:r>
+        <w:t xml:space="preserve"> </w:t>
+      </w:r>
+      <w:r>
+        <w:t xml:space="preserve">tag to the Home System product, so accessory-only reorders no longer trigger device onboarding.</w:t>
+      </w:r>
+      <w:r>
+        <w:t xml:space="preserve"> </w:t>
+      </w:r>
+      <w:r>
+        <w:t xml:space="preserve">- Google Business Profile verified/live; its review link is wired into the WF-07 review SMS (with Trustpilot); testimonial-form link live in the WF-07 email and on enyrgy.com.</w:t>
+      </w:r>
+      <w:r>
+        <w:t xml:space="preserve"> </w:t>
+      </w:r>
+      <w:r>
+        <w:t xml:space="preserve">- The full Paperclip agent org (deployed, KB loaded, compliance gate proven, GHL bridge read-write, heartbeats staged and tuned to an early-stage lineup; several agents held until volume ramps).</w:t>
+      </w:r>
+      <w:r>
+        <w:t xml:space="preserve"> </w:t>
+      </w:r>
+      <w:r>
+        <w:t xml:space="preserve">- Messaging: toll-free 888-316-1695 approved for SMS (the account has NO 10DLC/local number, contrary to an earlier doc claim); CNAM caller-ID Approved as</w:t>
+      </w:r>
+      <w:r>
+        <w:t xml:space="preserve"> </w:t>
+      </w:r>
+      <w:r>
+        <w:t xml:space="preserve">“Enyrgy Inc”</w:t>
+      </w:r>
+      <w:r>
+        <w:t xml:space="preserve">; sending domain mg.enyrgy.com.</w:t>
+      </w:r>
+      <w:r>
+        <w:t xml:space="preserve"> </w:t>
+      </w:r>
+      <w:r>
+        <w:t xml:space="preserve">- Content assets: commercial ROI one-pager (</w:t>
+      </w:r>
+      <w:r>
+        <w:rPr>
+          <w:rStyle w:val="VerbatimChar"/>
+        </w:rPr>
+        <w:t xml:space="preserve">Enyrgy_Commercial_ROI.pdf</w:t>
+      </w:r>
+      <w:r>
+        <w:t xml:space="preserve"> </w:t>
+      </w:r>
+      <w:r>
+        <w:t xml:space="preserve">+ HTML in repo); inbound voicemail greeting recorded.</w:t>
       </w:r>
     </w:p>
     <w:p>
@@ -166,7 +239,7 @@
           <w:b/>
           <w:bCs/>
         </w:rPr>
-        <w:t xml:space="preserve">New operational-reliability findings (add to the Security &amp; Compliance and Open Decisions layers at v1.1):</w:t>
+        <w:t xml:space="preserve">New operational-reliability findings (fold into the Security &amp; Compliance and Open Decisions layers on the next body pass):</w:t>
       </w:r>
     </w:p>
     <w:p>
@@ -254,25 +327,13 @@
           <w:b/>
           <w:bCs/>
         </w:rPr>
-        <w:t xml:space="preserve">Phantom task completion (platform correctness bug).</w:t>
-      </w:r>
-      <w:r>
-        <w:t xml:space="preserve"> </w:t>
-      </w:r>
-      <w:r>
-        <w:t xml:space="preserve">A run that died on</w:t>
-      </w:r>
-      <w:r>
-        <w:t xml:space="preserve"> </w:t>
-      </w:r>
-      <w:r>
-        <w:t xml:space="preserve">“Credit balance is too low”</w:t>
-      </w:r>
-      <w:r>
-        <w:t xml:space="preserve"> </w:t>
-      </w:r>
-      <w:r>
-        <w:t xml:space="preserve">was auto-flipped to</w:t>
+        <w:t xml:space="preserve">Phantom task completion — claim investigated and debunked (July 28).</w:t>
+      </w:r>
+      <w:r>
+        <w:t xml:space="preserve"> </w:t>
+      </w:r>
+      <w:r>
+        <w:t xml:space="preserve">A COO comment claimed a credit-failed run was auto-flipped to</w:t>
       </w:r>
       <w:r>
         <w:t xml:space="preserve"> </w:t>
@@ -284,22 +345,28 @@
         <w:t xml:space="preserve">done</w:t>
       </w:r>
       <w:r>
-        <w:t xml:space="preserve"> </w:t>
-      </w:r>
-      <w:r>
-        <w:t xml:space="preserve">with no execution, masking the unresolved item. Required fix: runs that die on a credit/budget error must transition to</w:t>
-      </w:r>
-      <w:r>
-        <w:t xml:space="preserve"> </w:t>
+        <w:t xml:space="preserve">. A review of the recovery state machine (</w:t>
       </w:r>
       <w:r>
         <w:rPr>
           <w:rStyle w:val="VerbatimChar"/>
         </w:rPr>
+        <w:t xml:space="preserve">server/src/services/recovery/service.ts</w:t>
+      </w:r>
+      <w:r>
+        <w:t xml:space="preserve">) found credit/budget failures classify as non-retryable and route to</w:t>
+      </w:r>
+      <w:r>
+        <w:t xml:space="preserve"> </w:t>
+      </w:r>
+      <w:r>
+        <w:rPr>
+          <w:rStyle w:val="VerbatimChar"/>
+        </w:rPr>
         <w:t xml:space="preserve">blocked</w:t>
       </w:r>
       <w:r>
-        <w:t xml:space="preserve">, never</w:t>
+        <w:t xml:space="preserve">; the only</w:t>
       </w:r>
       <w:r>
         <w:t xml:space="preserve"> </w:t>
@@ -311,7 +378,10 @@
         <w:t xml:space="preserve">done</w:t>
       </w:r>
       <w:r>
-        <w:t xml:space="preserve">.</w:t>
+        <w:t xml:space="preserve"> </w:t>
+      </w:r>
+      <w:r>
+        <w:t xml:space="preserve">transition is a legitimate watchdog-evaluation fold that requires a succeeded source run. There is no code path that marks a work issue done on a credit failure. The claim was another confabulation from the credit-starvation window, not a real defect. No code change made.</w:t>
       </w:r>
     </w:p>
     <w:p>
@@ -351,7 +421,37 @@
         <w:t xml:space="preserve"> </w:t>
       </w:r>
       <w:r>
-        <w:t xml:space="preserve">system-of-record ownership map; Device-App-to-GHL usage-data flow; OEM/Lumanova data-boundary formalization; and metric-governance owner. (The Shopify policy address exception noted in the body is RESOLVED as of July 28, 2026 — all store policies now show the Phoenix facility address, 5115 N 27th Ave, Bld 66, Phoenix, AZ 85017.)</w:t>
+        <w:t xml:space="preserve">system-of-record ownership map; Device-App-to-GHL usage-data flow; OEM/Lumanova data-boundary formalization; and metric-governance owner.</w:t>
+      </w:r>
+    </w:p>
+    <w:p>
+      <w:pPr>
+        <w:pStyle w:val="BodyText"/>
+      </w:pPr>
+      <w:r>
+        <w:rPr>
+          <w:b/>
+          <w:bCs/>
+        </w:rPr>
+        <w:t xml:space="preserve">Resolved / new since v1.0 (July 28, 2026):</w:t>
+      </w:r>
+      <w:r>
+        <w:t xml:space="preserve"> </w:t>
+      </w:r>
+      <w:r>
+        <w:t xml:space="preserve">the Shopify policy address exception in the body is RESOLVED — all store policies, and the GHL agency profile, now show the Phoenix facility address (5115 N 27th Ave, Bld 66, Phoenix, AZ 85017). GHL agency Business Category corrected from Medical to Health &amp; Wellness (matches the wellness positioning). One open infra item, tracked in the Master TODO: Enyrgy agency system emails send with the sender name</w:t>
+      </w:r>
+      <w:r>
+        <w:t xml:space="preserve"> </w:t>
+      </w:r>
+      <w:r>
+        <w:t xml:space="preserve">“Ledgerix Pro LLC”</w:t>
+      </w:r>
+      <w:r>
+        <w:t xml:space="preserve"> </w:t>
+      </w:r>
+      <w:r>
+        <w:t xml:space="preserve">(Scott’s separate GHL agency); both agencies are internally correct, so it is a HighLevel platform cross-agency sender-identity issue awaiting a support ticket.</w:t>
       </w:r>
     </w:p>
     <w:p>

</xml_diff>